<commit_message>
Prepare verified international sample dataset and private submission export tools
</commit_message>
<xml_diff>
--- a/Documentation/Frontend/Gather-and-Grow-Project-Documentation-Updated.docx
+++ b/Documentation/Frontend/Gather-and-Grow-Project-Documentation-Updated.docx
@@ -2023,6 +2023,75 @@
     <w:p>
       <w:r>
         <w:t>Source: MarketLink Software Requirements Specification version 1.0, sections 1.5, 1.6, 1.7 and 1.9; current application routes, pages and services. AI assistance must be acknowledged. The SRS prohibits fully AI-produced ready-made documentation, so this appendix remains a reference draft for meaningful owner review and rewriting.</w:t>
+      </w:r>
+    </w:p>
+    <w:p>
+      <w:r>
+        <w:br w:type="page"/>
+      </w:r>
+    </w:p>
+    <w:p>
+      <w:pPr>
+        <w:pStyle w:val="Heading1"/>
+      </w:pPr>
+      <w:r>
+        <w:t>Submission database and installation</w:t>
+      </w:r>
+    </w:p>
+    <w:p>
+      <w:r>
+        <w:t>The submission dataset contains 10 countries and 40 cities. Each city has two sample markets. Each market has four sample growers, and each grower has four products. This gives 80 markets, 320 growers and 1280 products. The existing administrator account is preserved. Old customer accounts, orders, reviews and other related records have been removed after a private backup.</w:t>
+      </w:r>
+    </w:p>
+    <w:p>
+      <w:r>
+        <w:t>The markets, growers, prices and available quantities are illustrative evaluation data. They are not verified real businesses. Market pins identify approximate city centres. The country and city information supports browsing, but does not prove actual market coverage. There are no fabricated customer reviews or sales records in the new export.</w:t>
+      </w:r>
+    </w:p>
+    <w:p>
+      <w:r>
+        <w:t>The dataset includes 5120 dated stock offers and 2560 pickup windows for four upcoming weekend dates. Stock offers and pickup windows reference the same farmer, market and date. There are 40 available units per stock offer and no reserved units initially. Reservations must still pass the application stock and cutoff checks.</w:t>
+      </w:r>
+    </w:p>
+    <w:p>
+      <w:pPr>
+        <w:pStyle w:val="Heading2"/>
+      </w:pPr>
+      <w:r>
+        <w:t>Running the project</w:t>
+      </w:r>
+    </w:p>
+    <w:p>
+      <w:r>
+        <w:t>Install dependencies with npm ci separately in Client and Server. Configure the server environment using Server/.env.example and your own database and provider settings. Do not put server secrets in browser variables. Start the server and client with npm run dev in their respective directories. Build the frontend with npm run build from Client.</w:t>
+      </w:r>
+    </w:p>
+    <w:p>
+      <w:r>
+        <w:t>The Database File folder contains MarketLink.ejson and a count and checksum manifest. It uses canonical MongoDB Extended JSON to preserve object identifiers and dates. To restore it, configure an empty evaluation database and run node scripts/restore-submission.mjs followed by the absolute export path from Server. The restore script refuses a nonempty target. Do not run the older npm run seed command on the submission database.</w:t>
+      </w:r>
+    </w:p>
+    <w:p>
+      <w:r>
+        <w:t>The export preserves the existing administrator password hash. Keep it and the submission archive private. The source repository does not include the database export or environment credentials. Sample grower accounts use example.test addresses and an unavailable random password. Use real registration with an email you control to test OTP and farmer onboarding. No common sample-account password is published.</w:t>
+      </w:r>
+    </w:p>
+    <w:p>
+      <w:pPr>
+        <w:pStyle w:val="Heading2"/>
+      </w:pPr>
+      <w:r>
+        <w:t>Verification and remaining work</w:t>
+      </w:r>
+    </w:p>
+    <w:p>
+      <w:r>
+        <w:t>Local and live catalogue responses were checked on 28 September 2026 and both returned 80 markets, 320 growers, 1280 products and 2560 pickup windows. Automated dataset checks confirmed the requested hierarchy, stock and window relationships, and timezone cutoff conversion. These checks do not prove every reservation, email or AI operation works on the live server. Source deployment remains separate from updating the shared database.</w:t>
+      </w:r>
+    </w:p>
+    <w:p>
+      <w:r>
+        <w:t>Screenshots earlier in this document show the interface captured before the final sample-data reset. Their displayed names and counts may differ from the exported dataset. The project video is intentionally left for the owner. This document remains an AI-assisted reference draft for meaningful owner review and rewriting under the official competition rules. Its final pagination has not been visually verified because the local Word renderer is unavailable.</w:t>
       </w:r>
     </w:p>
     <w:sectPr>

</xml_diff>